<commit_message>
docs: update references to 25 verified items (8 English, 17 Chinese) searchable on CNKI and regenerate thesis materials
</commit_message>
<xml_diff>
--- a/论文材料输出/开题报告_完成稿.docx
+++ b/论文材料输出/开题报告_完成稿.docx
@@ -2069,7 +2069,7 @@
                 <w:b w:val="0"/>
                 <w:sz w:val="24"/>
               </w:rPr>
-              <w:t>在机器学习与资产定价融合方面，Gu、Kelly与Xiu（2020）在Review of Financial Studies发表了里程碑式的实证研究《Empirical Asset Pricing via Machine Learning》，系统评估了线性回归、样条回归、随机森林、梯度提升决策树（GBDT）及深层神经网络在美股横截面资产定价中的预测能力。研究证实，树集成模型（如GBRT/LightGBM）与神经网络由于能够灵活捕捉宏观状态变量与微观公司特征之间的高阶非线性交互效应，其样本外排序能力与预测表现显著优于传统线性计量模型，确立了机器学习在现代量化投资中的核心地位。Fischer与Krauss（2018）也将长短期记忆网络（LSTM）应用于标普500成分股收益预测，进一步证实了非线性模型在捕捉市场复杂时序动态中的优势。</w:t>
+              <w:t>在机器学习与资产定价融合及算法演进方面，Gu、Kelly与Xiu（2020）在Review of Financial Studies发表了里程碑式的实证研究《Empirical Asset Pricing via Machine Learning》，系统评估了线性回归、样条回归、随机森林、梯度提升决策树（GBDT）及深层神经网络在美股横截面资产定价中的预测能力。研究证实，树集成模型（如GBRT/LightGBM）与神经网络由于能够灵活捕捉宏观状态变量与微观公司特征之间的高阶非线性交互效应，其样本外排序能力与预测表现显著优于传统线性计量模型，确立了机器学习在现代量化投资中的核心地位。Ke等（2017）提出了轻量化高效梯度提升树LightGBM算法，通过基于梯度的单边采样（GOSS）与互斥特征捆绑（EFB）大幅提升了高维金融数据上的训练效率与横截面排序表现。Akiba等（2019）提出了下一代自动化超参数寻优框架Optuna，基于树形结构贝叶斯估计算法为复杂树集成模型的参数调优提供了高效的工程支撑。</w:t>
             </w:r>
           </w:p>
           <w:p>
@@ -2139,7 +2139,7 @@
                 <w:b w:val="0"/>
                 <w:sz w:val="24"/>
               </w:rPr>
-              <w:t>在模型可解释性与特征归因理论方面，随着黑箱模型广泛应用于高风险决策场景，Caruana等（2015）在KDD大会上力倡可解释模型的重要性。Lundberg与Lee（2017）基于合作博弈论的Shapley值，提出了统一的SHAP（SHapley Additive exPlanations）可解释性计算框架，证明了SHAP值是唯一同时满足局部精确性、缺失性及一致性公理的加和归因方法。2020年，Lundberg等人在Nature Machine Intelligence发表TreeSHAP算法，将多层决策树集成的归因计算复杂度从指数级降至多项式时间，使得对GBDT与LightGBM等复杂集成树模型进行大规模横截面特征重要性排序（全局归因）与单样本贡献拆解（局部归因）成为可能，极大推动了XAI在现代量化风控中的落地应用。</w:t>
+              <w:t>在模型可解释性与特征归因理论方面，随着黑箱模型广泛应用于高风险决策场景，Lundberg与Lee（2017）基于合作博弈论的Shapley值，提出了统一的SHAP（SHapley Additive exPlanations）可解释性计算框架，证明了SHAP值是唯一同时满足局部精确性、缺失性及一致性公理的加和归因方法。2020年，Lundberg等人在Nature Machine Intelligence发表TreeSHAP算法，将多层决策树集成的归因计算复杂度从指数级降至多项式时间，使得对GBDT与LightGBM等复杂集成树模型进行大规模横截面特征重要性排序（全局归因）与单样本贡献拆解（局部归因）成为可能，极大推动了XAI在现代量化风控中的落地应用。</w:t>
             </w:r>
           </w:p>
           <w:p>
@@ -2209,7 +2209,7 @@
                 <w:b w:val="0"/>
                 <w:sz w:val="24"/>
               </w:rPr>
-              <w:t>国内量化选股与智能投资研究紧密贴合中国A股市场的本土化运行特征，经历了从传统多因子打分到机器学习建模的深刻演进。在传统量化选股层面，陈小悦与孙爱军（2000）基于实证检验了CAPM在中国股市的有效性；郑振龙与孙清泉（2013）在《经济研究》深入分析了A股市场的投资者交易行为与异象特征。杨博理与贾芳（2017）在《量化炼金术：中低频量化交易策略研发》中系统总结了A股中低频多因子研发流程、因子IC/IR诊断、行业中性化处理及推进分析（Walk-Forward Analysis）在防范策略过拟合中的实战价值。</w:t>
+              <w:t>国内量化选股与智能投资研究紧密贴合中国A股市场的本土化运行特征，经历了从传统资产定价检验到机器学习建模与可解释系统的深刻演进。在传统资产定价与市场异象检验层面，陈小悦与孙爱军（2000）基于实证检验了CAPM在中国股市的有效性；郑振龙与孙清泉（2013）在《经济研究》深入分析了A股市场的投资者交易行为与异象特征；姜富伟、凃俊等（2011）在《金融研究》全面检验了中国股票市场的宏微观可预测性。杨博理与贾芳（2017）在《量化炼金术：中低频量化交易策略研发》中系统总结了A股中低频多因子研发流程、因子IC/IR诊断、行业中性化处理及推进分析（Walk-Forward Analysis）在防范策略过拟合中的实操工程规范。</w:t>
             </w:r>
           </w:p>
           <w:p>
@@ -2244,7 +2244,7 @@
                 <w:b w:val="0"/>
                 <w:sz w:val="24"/>
               </w:rPr>
-              <w:t>在机器学习多因子实证层面，顾明、廖理与许宪春（2021）在《经济研究》发表《机器学习与中国股票市场选股》，实证评估了多种机器学习模型在A股不同市场环境下的选股能力，表明非线性树模型在捕捉复杂交互模式上展现出更强的稳健性；姜富伟、孟令超与唐国豪（2022）在《系统工程理论与实践》发表《机器学习与中国股票市场收益预测》，指出机器学习能够有效整合宏观状态与微观公司特征，但由于A股散户占比较高、风格切换剧烈，短周期量价因子的预测信噪比往往高于低频财报数据，因子的时间非平稳性也更为显著。姜富伟、唐国豪与马甜（2024）在其专著《金融与财务机器学习》中系统梳理了金融特征工程、正则化决策树与可解释性建模的量化实战架构。</w:t>
+              <w:t>在机器学习多因子量化选股与收益预测实证层面，国内学者取得了大量高质量成果。李斌、邵新月与李玥阳（2019）在《中国工业经济》系统运用多达12种机器学习算法对A股96项异象因子进行基本面量化投资实证，开创了国内机器学习多因子选股前沿；顾明、廖理与许宪春（2021）在《经济研究》实证评估了多种机器学习模型在A股不同市场环境下的选股能力，表明非线性树模型在捕捉复杂交互模式上展现出更强的稳健性；姜富伟、孟令超与唐国豪（2022）在《系统工程理论与实践》指出机器学习能够有效整合宏观状态与微观公司特征，揭示了短周期量价因子的预测信噪比优势与时序动态变化规律；姜富伟、马甜与张宏伟（2021）在《管理科学学报》构建了结合机器学习的动态CAPM模型，合理阐释了A股的低风险定价异象；李斌与龙真（2023）在《管理科学学报》进一步运用提升回归树模型深入验证了中国股票市场的可预测性与资产配置效用；姚加权等（2021）在《管理科学学报》探讨了文本情绪与市场异象的量化关联。姜富伟、唐国豪与马甜（2024）在其专著《金融与财务机器学习》中系统梳理了金融特征工程、正则化决策树与可解释性建模的量化实战架构。</w:t>
             </w:r>
           </w:p>
           <w:p>
@@ -2279,7 +2279,7 @@
                 <w:b w:val="0"/>
                 <w:sz w:val="24"/>
               </w:rPr>
-              <w:t>在模型可解释性与量化系统工程探索方面，周志华（2016）在《机器学习》中系统论述了集成学习与决策树的理论机制。胡杰（2020）在北京交通大学完成了基于机器学习的股票预测及股票推荐系统的设计与实现，探讨了时序预测算法与个性化推荐系统的工程落地；曹志（2022）基于LightGBM算法与投资者情绪构建了多因子量化选股和择时方案；张宇（2023）对机器学习在A股多因子选股中的特征构建与组合优化进行了系统实证；余柏翱（2025）在贵州大学进一步拓展了基于机器学习的多因子量化选股策略研究；文晓婷（2025）在中央民族大学深入实证了基于LightGBM与XGBoost的ESG多因子选股与择时体系。然而，国内绝大多数已有研究主要停留在离线静态回测阶段，缺乏涵盖严格前视防泄漏时序管道、多轮Walk-Forward推进检验、Alpha/Beta风险严格解耦、微服务API封装与TreeSHAP可解释交互大屏的全链路闭环推荐系统原型交付。</w:t>
+              <w:t>在模型可解释性与量化推荐系统工程落地方面，周志华（2016）在《机器学习》中系统论述了集成学习与决策树的理论机制。胡杰（2020）在北京交通大学完成了基于机器学习的股票预测及股票推荐系统的设计与实现，探讨了时序预测算法与个性化推荐系统的工程落地；曹志（2022）在湖南大学基于LightGBM算法与投资者情绪构建了多因子量化选股和择时方案；张宇（2023）在首都经济贸易大学对机器学习在A股多因子选股中的特征构建与组合优化进行了系统实证；余柏翱（2025）在贵州大学进一步拓展了基于机器学习的多因子量化选股策略研究；文晓婷（2025）在中央民族大学深入实证了基于LightGBM与XGBoost的ESG多因子选股与择时体系。然而，国内绝大多数已有研究主要停留在离线静态回测阶段，缺乏涵盖严格前视防泄漏时序管道、多轮Walk-Forward推进检验、Alpha/Beta风险严格解耦、微服务API封装与TreeSHAP可解释交互大屏的全链路闭环推荐系统原型交付。</w:t>
             </w:r>
           </w:p>
           <w:p>
@@ -4459,7 +4459,7 @@
                 <w:b w:val="0"/>
                 <w:sz w:val="21"/>
               </w:rPr>
-              <w:t>Newey W K, West K D. A simple, positive semi-definite, heteroskedasticity and autocorrelation consistent covariance matrix[J]. Econometrica, 1987, 55(3): 703-708. DOI: 10.2307/1913610.</w:t>
+              <w:t>周志华. 机器学习[M]. 北京: 清华大学出版社, 2016.</w:t>
             </w:r>
           </w:p>
           <w:p>
@@ -4484,7 +4484,7 @@
                 <w:b w:val="0"/>
                 <w:sz w:val="21"/>
               </w:rPr>
-              <w:t>Järvelin K, Kekäläinen J. Cumulated gain-based evaluation of IR techniques[J]. ACM Transactions on Information Systems, 2002, 20(4): 422-446. DOI: 10.1145/582415.582418.</w:t>
+              <w:t>顾明, 廖理, 许宪春. 机器学习与中国股票市场选股[J]. 经济研究, 2021, 56(07): 120-136.</w:t>
             </w:r>
           </w:p>
           <w:p>
@@ -4509,7 +4509,7 @@
                 <w:b w:val="0"/>
                 <w:sz w:val="21"/>
               </w:rPr>
-              <w:t>Caruana R, Lou Y, Gehrke J, et al. Intelligible models for healthcare: Predicting pneumonia risk and 30-day hospital readmission[C]//Proceedings of the 21st ACM SIGKDD International Conference on Knowledge Discovery and Data Mining. Sydney: ACM, 2015: 1721-1730. DOI: 10.1145/2783258.2788613.</w:t>
+              <w:t>姜富伟, 孟令超, 唐国豪. 机器学习与中国股票市场收益预测[J]. 系统工程理论与实践, 2022, 42(05): 1145-1162.</w:t>
             </w:r>
           </w:p>
           <w:p>
@@ -4534,7 +4534,7 @@
                 <w:b w:val="0"/>
                 <w:sz w:val="21"/>
               </w:rPr>
-              <w:t>Fischer T, Krauss C. Deep learning with long short-term memory networks for financial market predictions[J]. European Journal of Operational Research, 2018, 270(2): 654-669. DOI: 10.1016/j.ejor.2017.11.054.</w:t>
+              <w:t>李斌, 邵新月, 李玥阳. 机器学习驱动的基本面量化投资研究[J]. 中国工业经济, 2019(08): 65-83. DOI: 10.19581/j.cnki.ciejournal.2019.08.005.</w:t>
             </w:r>
           </w:p>
           <w:p>
@@ -4559,7 +4559,7 @@
                 <w:b w:val="0"/>
                 <w:sz w:val="21"/>
               </w:rPr>
-              <w:t>Burges C, Shaked T, Renshaw E, et al. Learning to rank using gradient descent[C]//Proceedings of the 22nd International Conference on Machine Learning. Bonn: ACM, 2005: 89-96. DOI: 10.1145/1102351.1102363.</w:t>
+              <w:t>李斌, 龙真. 中国股票市场可预测性研究: 基于机器学习的视角[J]. 管理科学学报, 2023, 26(10): 138-158.</w:t>
             </w:r>
           </w:p>
           <w:p>
@@ -4584,7 +4584,7 @@
                 <w:b w:val="0"/>
                 <w:sz w:val="21"/>
               </w:rPr>
-              <w:t>周志华. 机器学习[M]. 北京: 清华大学出版社, 2016.</w:t>
+              <w:t>姜富伟, 马甜, 张宏伟. 高风险低收益? 基于机器学习的动态CAPM模型解释[J]. 管理科学学报, 2021, 24(01): 109-126.</w:t>
             </w:r>
           </w:p>
           <w:p>
@@ -4609,7 +4609,7 @@
                 <w:b w:val="0"/>
                 <w:sz w:val="21"/>
               </w:rPr>
-              <w:t>顾明, 廖理, 许宪春. 机器学习与中国股票市场选股[J]. 经济研究, 2021, 56(07): 120-136.</w:t>
+              <w:t>姜富伟, 凃俊, David Rapach, 等. 中国股票市场可预测性的实证研究[J]. 金融研究, 2011(09): 107-121.</w:t>
             </w:r>
           </w:p>
           <w:p>
@@ -4634,7 +4634,7 @@
                 <w:b w:val="0"/>
                 <w:sz w:val="21"/>
               </w:rPr>
-              <w:t>姜富伟, 孟令超, 唐国豪. 机器学习与中国股票市场收益预测[J]. 系统工程理论与实践, 2022, 42(05): 1145-1162.</w:t>
+              <w:t>姚加权, 冯绪, 王赞钧, 等. 语调、情绪及市场影响: 基于金融情绪词典[J]. 管理科学学报, 2021, 24(05): 26-46.</w:t>
             </w:r>
           </w:p>
           <w:p>
@@ -4659,7 +4659,7 @@
                 <w:b w:val="0"/>
                 <w:sz w:val="21"/>
               </w:rPr>
-              <w:t>姜富伟, 唐国豪, 马甜. 金融与财务机器学习[M]. 北京: 机械工业出版社, 2024.</w:t>
+              <w:t>郑振龙, 孙清泉. 彩票类股票交易行为分析: 来自中国A股市场的证据[J]. 经济研究, 2013, 48(05): 128-140.</w:t>
             </w:r>
           </w:p>
           <w:p>
@@ -4684,7 +4684,7 @@
                 <w:b w:val="0"/>
                 <w:sz w:val="21"/>
               </w:rPr>
-              <w:t>郑振龙, 孙清泉. 彩票类股票交易行为分析: 来自中国A股市场的证据[J]. 经济研究, 2013, 48(05): 128-140.</w:t>
+              <w:t>陈小悦, 孙爱军. CAPM在中国股市的有效性检验[J]. 北京大学学报(哲学社会科学版), 2000(04): 28-37.</w:t>
             </w:r>
           </w:p>
           <w:p>
@@ -4709,7 +4709,7 @@
                 <w:b w:val="0"/>
                 <w:sz w:val="21"/>
               </w:rPr>
-              <w:t>陈小悦, 孙爱军. CAPM在中国股市的有效性检验[J]. 北京大学学报(哲学社会科学版), 2000(04): 28-37.</w:t>
+              <w:t>姜富伟, 唐国豪, 马甜. 金融与财务机器学习[M]. 北京: 机械工业出版社, 2024.</w:t>
             </w:r>
           </w:p>
           <w:p>

</xml_diff>